<commit_message>
Hogar de Refugio: sustento normativo cotejado con la R.V.M. 208-2019-MINEDU
Co-Authored-By: Claude Opus 5.5 <noreply@anthropic.com>
Claude-Session: https://claude.ai/code/session_0142t8T16igb3VKxUPwnQPq6
</commit_message>
<xml_diff>
--- a/entregables/ANALISIS_INCOMPATIBILIDADES_UBICACION_HOGAR_REFUGIO.docx
+++ b/entregables/ANALISIS_INCOMPATIBILIDADES_UBICACION_HOGAR_REFUGIO.docx
@@ -1121,6 +1121,50 @@
                 <w:sz w:val="17"/>
               </w:rPr>
               <w:t>Cuadro de incompatibilidades de uso del terreno, que reúne los dispositivos legales sectoriales y sus distancias; se adopta como lista de verificación.</w:t>
+            </w:r>
+          </w:p>
+        </w:tc>
+      </w:tr>
+      <w:tr>
+        <w:tc>
+          <w:tcPr>
+            <w:tcW w:type="dxa" w:w="3175"/>
+            <w:vAlign w:val="center"/>
+          </w:tcPr>
+          <w:p>
+            <w:pPr>
+              <w:keepNext/>
+              <w:spacing w:after="20" w:before="20"/>
+              <w:jc w:val="left"/>
+            </w:pPr>
+            <w:r>
+              <w:rPr>
+                <w:b w:val="0"/>
+                <w:i w:val="0"/>
+                <w:sz w:val="17"/>
+              </w:rPr>
+              <w:t>R.V.M. N.° 208-2019-MINEDU, art. 8 c)</w:t>
+            </w:r>
+          </w:p>
+        </w:tc>
+        <w:tc>
+          <w:tcPr>
+            <w:tcW w:type="dxa" w:w="5896"/>
+            <w:vAlign w:val="center"/>
+          </w:tcPr>
+          <w:p>
+            <w:pPr>
+              <w:keepNext/>
+              <w:spacing w:after="20" w:before="20"/>
+              <w:jc w:val="left"/>
+            </w:pPr>
+            <w:r>
+              <w:rPr>
+                <w:b w:val="0"/>
+                <w:i w:val="0"/>
+                <w:sz w:val="17"/>
+              </w:rPr>
+              <w:t>Para la adecuada selección del terreno se deben tomar en cuenta las condiciones del terreno, así como su disponibilidad, establecidas en la N.T. Criterios Generales.</w:t>
             </w:r>
           </w:p>
         </w:tc>

</xml_diff>

<commit_message>
Hogar de Refugio: análisis de ubicación rehecho para el hogar (condiciones propias del servicio)
Co-Authored-By: Claude Opus 5.5 <noreply@anthropic.com>
Claude-Session: https://claude.ai/code/session_0142t8T16igb3VKxUPwnQPq6
</commit_message>
<xml_diff>
--- a/entregables/ANALISIS_INCOMPATIBILIDADES_UBICACION_HOGAR_REFUGIO.docx
+++ b/entregables/ANALISIS_INCOMPATIBILIDADES_UBICACION_HOGAR_REFUGIO.docx
@@ -544,7 +544,7 @@
           <w:i w:val="0"/>
           <w:sz w:val="22"/>
         </w:rPr>
-        <w:t>El presente análisis verifica que el terreno del proyecto “CREACIÓN DEL SERVICIO DE PROTECCIÓN A MUJERES VÍCTIMAS DE VIOLENCIA EN SITUACIÓN DE RIESGO DE FEMINICIDIO O PELIGRE SU INTEGRIDAD Y/O SALUD FÍSICA Y/O MENTAL EN HOGAR DE REFUGIO TEMPORAL DISTRITO DE MORALES DE LA PROVINCIA DE SAN MARTÍN DEL DEPARTAMENTO DE SAN MARTÍN”, con CUI N.° 2675514, no presenta incompatibilidades de uso por cercanía a actividades, instalaciones o servidumbres reguladas por la normativa vigente, de modo que su ubicación es apta para el Hogar de Refugio Temporal.</w:t>
+        <w:t>El presente análisis verifica que el terreno del proyecto “CREACIÓN DEL SERVICIO DE PROTECCIÓN A MUJERES VÍCTIMAS DE VIOLENCIA EN SITUACIÓN DE RIESGO DE FEMINICIDIO O PELIGRE SU INTEGRIDAD Y/O SALUD FÍSICA Y/O MENTAL EN HOGAR DE REFUGIO TEMPORAL DISTRITO DE MORALES DE LA PROVINCIA DE SAN MARTÍN DEL DEPARTAMENTO DE SAN MARTÍN”, con CUI N.° 2675514, es apto para un Hogar de Refugio Temporal: que no presenta incompatibilidades de uso por cercanía a actividades, instalaciones o servidumbres reguladas por la normativa vigente, y que reúne las condiciones de ubicación que requiere este servicio de protección.</w:t>
       </w:r>
     </w:p>
     <w:p>
@@ -552,7 +552,29 @@
         <w:pStyle w:val="Heading2"/>
       </w:pPr>
       <w:r>
-        <w:t>1.2  Ubicación del predio</w:t>
+        <w:t>1.2  El servicio y sus exigencias de ubicación</w:t>
+      </w:r>
+    </w:p>
+    <w:p>
+      <w:pPr>
+        <w:spacing w:before="0" w:after="120" w:line="276" w:lineRule="auto"/>
+        <w:jc w:val="both"/>
+      </w:pPr>
+      <w:r>
+        <w:rPr>
+          <w:b w:val="0"/>
+          <w:i w:val="0"/>
+          <w:sz w:val="22"/>
+        </w:rPr>
+        <w:t>El Hogar de Refugio Temporal brinda protección, albergue, alimentación y atención multidisciplinaria a mujeres víctimas de violencia en situación de riesgo de feminicidio, y a sus hijas e hijos, en el marco de la Ley N.° 30364 y su Reglamento. Por la naturaleza del servicio, su ubicación debe garantizar la seguridad de las residentes, la reserva del uso, un entorno tranquilo y no aislado, y la cercanía a los servicios de salud, seguridad y justicia. Al residir en él niñas y niños, debe además evitar las actividades e instalaciones que la normativa sectorial considera incompatibles con su permanencia.</w:t>
+      </w:r>
+    </w:p>
+    <w:p>
+      <w:pPr>
+        <w:pStyle w:val="Heading2"/>
+      </w:pPr>
+      <w:r>
+        <w:t>1.3  Ubicación del predio</w:t>
       </w:r>
     </w:p>
     <w:p>
@@ -912,7 +934,7 @@
           <w:i w:val="0"/>
           <w:sz w:val="22"/>
         </w:rPr>
-        <w:t>El Hogar de Refugio Temporal es una edificación de protección social (Norma A.090) que incluye ambientes educativos; por ello se verifica su ubicación con las disposiciones siguientes:</w:t>
+        <w:t>La ubicación del Hogar de Refugio Temporal se verifica con las normas asignadas al proyecto:</w:t>
       </w:r>
     </w:p>
     <w:p>
@@ -1011,6 +1033,94 @@
                 <w:i w:val="0"/>
                 <w:sz w:val="17"/>
               </w:rPr>
+              <w:t>Ley N.° 30364 y su Reglamento (D.S. N.° 009-2016-MIMP y modificatorias)</w:t>
+            </w:r>
+          </w:p>
+        </w:tc>
+        <w:tc>
+          <w:tcPr>
+            <w:tcW w:type="dxa" w:w="5896"/>
+            <w:vAlign w:val="center"/>
+          </w:tcPr>
+          <w:p>
+            <w:pPr>
+              <w:keepNext/>
+              <w:spacing w:after="20" w:before="20"/>
+              <w:jc w:val="left"/>
+            </w:pPr>
+            <w:r>
+              <w:rPr>
+                <w:b w:val="0"/>
+                <w:i w:val="0"/>
+                <w:sz w:val="17"/>
+              </w:rPr>
+              <w:t>Marco del servicio de Hogares de Refugio Temporal: protección, albergue y atención de mujeres víctimas de violencia y de sus hijas e hijos.</w:t>
+            </w:r>
+          </w:p>
+        </w:tc>
+      </w:tr>
+      <w:tr>
+        <w:tc>
+          <w:tcPr>
+            <w:tcW w:type="dxa" w:w="3175"/>
+            <w:vAlign w:val="center"/>
+          </w:tcPr>
+          <w:p>
+            <w:pPr>
+              <w:keepNext/>
+              <w:spacing w:after="20" w:before="20"/>
+              <w:jc w:val="left"/>
+            </w:pPr>
+            <w:r>
+              <w:rPr>
+                <w:b w:val="0"/>
+                <w:i w:val="0"/>
+                <w:sz w:val="17"/>
+              </w:rPr>
+              <w:t>R.M. N.° 150-2016-MIMP</w:t>
+            </w:r>
+          </w:p>
+        </w:tc>
+        <w:tc>
+          <w:tcPr>
+            <w:tcW w:type="dxa" w:w="5896"/>
+            <w:vAlign w:val="center"/>
+          </w:tcPr>
+          <w:p>
+            <w:pPr>
+              <w:keepNext/>
+              <w:spacing w:after="20" w:before="20"/>
+              <w:jc w:val="left"/>
+            </w:pPr>
+            <w:r>
+              <w:rPr>
+                <w:b w:val="0"/>
+                <w:i w:val="0"/>
+                <w:sz w:val="17"/>
+              </w:rPr>
+              <w:t>Lineamientos para la atención y funcionamiento de los Hogares de Refugio Temporal.</w:t>
+            </w:r>
+          </w:p>
+        </w:tc>
+      </w:tr>
+      <w:tr>
+        <w:tc>
+          <w:tcPr>
+            <w:tcW w:type="dxa" w:w="3175"/>
+            <w:vAlign w:val="center"/>
+          </w:tcPr>
+          <w:p>
+            <w:pPr>
+              <w:keepNext/>
+              <w:spacing w:after="20" w:before="20"/>
+              <w:jc w:val="left"/>
+            </w:pPr>
+            <w:r>
+              <w:rPr>
+                <w:b w:val="0"/>
+                <w:i w:val="0"/>
+                <w:sz w:val="17"/>
+              </w:rPr>
               <w:t>RNE, Norma A.090 Servicios Comunales, art. 3</w:t>
             </w:r>
           </w:p>
@@ -1033,6 +1143,50 @@
                 <w:sz w:val="17"/>
               </w:rPr>
               <w:t>Las edificaciones de servicios comunales se ubicarán en los lugares señalados en los Planes de Desarrollo Urbano, o en zonas compatibles con la zonificación vigente.</w:t>
+            </w:r>
+          </w:p>
+        </w:tc>
+      </w:tr>
+      <w:tr>
+        <w:tc>
+          <w:tcPr>
+            <w:tcW w:type="dxa" w:w="3175"/>
+            <w:vAlign w:val="center"/>
+          </w:tcPr>
+          <w:p>
+            <w:pPr>
+              <w:keepNext/>
+              <w:spacing w:after="20" w:before="20"/>
+              <w:jc w:val="left"/>
+            </w:pPr>
+            <w:r>
+              <w:rPr>
+                <w:b w:val="0"/>
+                <w:i w:val="0"/>
+                <w:sz w:val="17"/>
+              </w:rPr>
+              <w:t>RNE, Norma A.090, art. 4</w:t>
+            </w:r>
+          </w:p>
+        </w:tc>
+        <w:tc>
+          <w:tcPr>
+            <w:tcW w:type="dxa" w:w="5896"/>
+            <w:vAlign w:val="center"/>
+          </w:tcPr>
+          <w:p>
+            <w:pPr>
+              <w:keepNext/>
+              <w:spacing w:after="20" w:before="20"/>
+              <w:jc w:val="left"/>
+            </w:pPr>
+            <w:r>
+              <w:rPr>
+                <w:b w:val="0"/>
+                <w:i w:val="0"/>
+                <w:sz w:val="17"/>
+              </w:rPr>
+              <w:t>Los proyectos que supongan una concentración de público de más de 500 personas deberán contar con un estudio de impacto vial.</w:t>
             </w:r>
           </w:p>
         </w:tc>
@@ -1206,7 +1360,7 @@
                 <w:i w:val="0"/>
                 <w:sz w:val="17"/>
               </w:rPr>
-              <w:t>Ubicación en una zona tranquila, no aislada, con servicios e instituciones de apoyo cercanos, alumbrado público, transporte público y accesos alternativos.</w:t>
+              <w:t>Ubicación en una zona tranquila, no aislada, con servicios e instituciones de apoyo cercanos, alumbrado público, transporte público y accesos alternativos; numerales 2.2 a 2.8: recinto cercado, reserva del uso, seguridad, accesos y servicios básicos.</w:t>
             </w:r>
           </w:p>
         </w:tc>
@@ -1238,7 +1392,7 @@
           <w:i w:val="0"/>
           <w:sz w:val="22"/>
         </w:rPr>
-        <w:t>El cuadro de incompatibilidades de la R.V.M. N.° 010-2022-MINEDU es el instrumento sectorial que reúne, para una edificación con permanencia de niñas y niños, las distancias y restricciones de los dispositivos legales de cada sector (salud, energía y minas, transportes, recursos hídricos y gobiernos locales); por ello se adopta para el Hogar de Refugio Temporal, que alberga a mujeres con sus hijas e hijos.</w:t>
+        <w:t>No existe una relación de incompatibilidades de uso propia de los hogares de refugio. Por ello se toma la relación de dispositivos legales sectoriales que reúne la N.T. Criterios Generales de Diseño (R.V.M. N.° 010-2022-MINEDU), a la que remiten la Norma A.040 y la R.V.M. N.° 208-2019-MINEDU para los locales con permanencia de niñas y niños, y se complementa con las condiciones de ubicación que los lineamientos para refugios establecen para este servicio.</w:t>
       </w:r>
     </w:p>
     <w:p>
@@ -1260,7 +1414,7 @@
           <w:b w:val="0"/>
           <w:i w:val="0"/>
         </w:rPr>
-        <w:t>•  Se define el área de influencia del predio como la franja medida desde el lindero con la distancia que fija cada dispositivo legal: 50 m (estaciones de servicio), 100 m (establecimientos de salud, GLP, bebidas alcohólicas y plantas de combustibles), 150 m (velatorios y cementerios) y 200 m (ductos de hidrocarburos).</w:t>
+        <w:t>•  Incompatibilidades por cercanía (Cuadro N.° 1): se define el área de influencia del predio como la franja medida desde el lindero con la distancia que fija cada dispositivo legal: 50 m (estaciones de servicio), 100 m (establecimientos de salud, GLP, bebidas alcohólicas y plantas de combustibles), 150 m (velatorios y cementerios) y 200 m (ductos de hidrocarburos). Para las que no tienen distancia fija (fajas marginales, servidumbres eléctricas, aeródromos, vías, restricciones radioeléctricas y usos regulados por la municipalidad) se verifica que la restricción no alcance al predio.</w:t>
       </w:r>
     </w:p>
     <w:p>
@@ -1274,7 +1428,7 @@
           <w:b w:val="0"/>
           <w:i w:val="0"/>
         </w:rPr>
-        <w:t>•  Para las incompatibilidades sin distancia fija (fajas marginales, servidumbres eléctricas, aeródromos, vías, restricciones radioeléctricas y usos regulados por la municipalidad) se verifica que la restricción no alcance al predio.</w:t>
+        <w:t>•  Condiciones propias del hogar (Cuadro N.° 2): se verifica cada condición de ubicación de los lineamientos y del RNE con las características del predio y del programa arquitectónico.</w:t>
       </w:r>
     </w:p>
     <w:p>
@@ -1302,7 +1456,7 @@
           <w:b w:val="0"/>
           <w:i w:val="0"/>
         </w:rPr>
-        <w:t>•  Cada incompatibilidad se califica como CUMPLE cuando la actividad o restricción no existe dentro del área de influencia.</w:t>
+        <w:t>•  Cada punto se califica como CUMPLE cuando la actividad o restricción no existe dentro del área de influencia, o cuando el predio y el proyecto satisfacen la condición.</w:t>
       </w:r>
     </w:p>
     <w:p>
@@ -1323,7 +1477,7 @@
         <w:pStyle w:val="Heading1"/>
       </w:pPr>
       <w:r>
-        <w:t>4.  CUADRO DE INCOMPATIBILIDADES DE UBICACIÓN</w:t>
+        <w:t>4.  INCOMPATIBILIDADES DE UBICACIÓN POR CERCANÍA</w:t>
       </w:r>
     </w:p>
     <w:p>
@@ -1338,7 +1492,7 @@
           <w:i w:val="0"/>
           <w:sz w:val="20"/>
         </w:rPr>
-        <w:t>Tabla N.° 03: Cuadro N.° 1: incompatibilidades de uso del terreno, según la R.V.M. N.° 010-2022-MINEDU - Hogar de Refugio Temporal</w:t>
+        <w:t>Tabla N.° 03: Cuadro N.° 1: incompatibilidades de uso del terreno por cercanía - Hogar de Refugio Temporal (relación de la R.V.M. N.° 010-2022-MINEDU)</w:t>
       </w:r>
     </w:p>
     <w:tbl>
@@ -1720,7 +1874,7 @@
                 <w:i w:val="0"/>
                 <w:sz w:val="16"/>
               </w:rPr>
-              <w:t>El establecimiento de salud de la localidad se encuentra a más de 100 m del predio.</w:t>
+              <w:t>El establecimiento de salud de la localidad se encuentra a más de 100 m del predio y forma parte de los servicios de apoyo cercanos que requiere el hogar.</w:t>
             </w:r>
           </w:p>
         </w:tc>
@@ -2095,7 +2249,7 @@
                 <w:i w:val="0"/>
                 <w:sz w:val="16"/>
               </w:rPr>
-              <w:t>No existen locales de venta y consumo de bebidas alcohólicas a menos de 100 m del predio.</w:t>
+              <w:t>No existen locales de venta y consumo de bebidas alcohólicas a menos de 100 m del predio, lo que favorece la tranquilidad y la seguridad de las residentes.</w:t>
             </w:r>
           </w:p>
         </w:tc>
@@ -3720,7 +3874,1057 @@
                 <w:i w:val="0"/>
                 <w:sz w:val="16"/>
               </w:rPr>
-              <w:t>No existen hostales, peñas, discotecas, video-pubs, bingos ni salas de billar en el entorno del predio.</w:t>
+              <w:t>No existen hostales, peñas, discotecas, video-pubs, bingos ni salas de billar en el entorno del predio; el entorno es tranquilo, como lo requiere un hogar de refugio.</w:t>
+            </w:r>
+          </w:p>
+        </w:tc>
+        <w:tc>
+          <w:tcPr>
+            <w:tcW w:type="dxa" w:w="964"/>
+            <w:vAlign w:val="center"/>
+          </w:tcPr>
+          <w:p>
+            <w:pPr>
+              <w:spacing w:after="20" w:before="20"/>
+              <w:jc w:val="center"/>
+            </w:pPr>
+            <w:r>
+              <w:rPr>
+                <w:b w:val="0"/>
+                <w:i w:val="0"/>
+                <w:sz w:val="16"/>
+              </w:rPr>
+              <w:t>CUMPLE</w:t>
+            </w:r>
+          </w:p>
+        </w:tc>
+      </w:tr>
+    </w:tbl>
+    <w:p>
+      <w:pPr>
+        <w:spacing w:before="0" w:after="160" w:line="276" w:lineRule="auto"/>
+        <w:jc w:val="both"/>
+      </w:pPr>
+      <w:r>
+        <w:rPr>
+          <w:b w:val="0"/>
+          <w:i/>
+          <w:color w:val="595959"/>
+          <w:sz w:val="18"/>
+        </w:rPr>
+        <w:t>Fuente: Elaboración propia.</w:t>
+      </w:r>
+    </w:p>
+    <w:p>
+      <w:pPr>
+        <w:pStyle w:val="Heading1"/>
+      </w:pPr>
+      <w:r>
+        <w:t>5.  CONDICIONES DE UBICACIÓN PROPIAS DEL HOGAR DE REFUGIO</w:t>
+      </w:r>
+    </w:p>
+    <w:p>
+      <w:pPr>
+        <w:keepNext/>
+        <w:spacing w:before="80" w:after="40" w:line="276" w:lineRule="auto"/>
+        <w:jc w:val="center"/>
+      </w:pPr>
+      <w:r>
+        <w:rPr>
+          <w:b/>
+          <w:i w:val="0"/>
+          <w:sz w:val="20"/>
+        </w:rPr>
+        <w:t>Tabla N.° 04: Cuadro N.° 2: condiciones de ubicación del Hogar de Refugio Temporal (lineamientos para refugios y RNE)</w:t>
+      </w:r>
+    </w:p>
+    <w:tbl>
+      <w:tblPr>
+        <w:tblStyle w:val="TableGrid"/>
+        <w:tblW w:type="auto" w:w="0"/>
+        <w:jc w:val="center"/>
+        <w:tblLayout w:type="fixed"/>
+        <w:tblLook w:firstColumn="1" w:firstRow="1" w:lastColumn="0" w:lastRow="0" w:noHBand="0" w:noVBand="1" w:val="04A0"/>
+      </w:tblPr>
+      <w:tblGrid>
+        <w:gridCol w:w="510"/>
+        <w:gridCol w:w="3061"/>
+        <w:gridCol w:w="2608"/>
+        <w:gridCol w:w="7427"/>
+        <w:gridCol w:w="963"/>
+      </w:tblGrid>
+      <w:tr>
+        <w:trPr>
+          <w:tblHeader w:val="true"/>
+          <w:cantSplit/>
+        </w:trPr>
+        <w:tc>
+          <w:tcPr>
+            <w:tcW w:type="dxa" w:w="510"/>
+            <w:shd w:val="clear" w:color="auto" w:fill="7B1E2B"/>
+            <w:vAlign w:val="center"/>
+          </w:tcPr>
+          <w:p>
+            <w:pPr>
+              <w:keepNext/>
+              <w:spacing w:after="20" w:before="20"/>
+              <w:jc w:val="center"/>
+            </w:pPr>
+            <w:r>
+              <w:rPr>
+                <w:b/>
+                <w:i w:val="0"/>
+                <w:color w:val="FFFFFF"/>
+                <w:sz w:val="16"/>
+              </w:rPr>
+              <w:t>N.°</w:t>
+            </w:r>
+          </w:p>
+        </w:tc>
+        <w:tc>
+          <w:tcPr>
+            <w:tcW w:type="dxa" w:w="3061"/>
+            <w:shd w:val="clear" w:color="auto" w:fill="7B1E2B"/>
+            <w:vAlign w:val="center"/>
+          </w:tcPr>
+          <w:p>
+            <w:pPr>
+              <w:keepNext/>
+              <w:spacing w:after="20" w:before="20"/>
+              <w:jc w:val="center"/>
+            </w:pPr>
+            <w:r>
+              <w:rPr>
+                <w:b/>
+                <w:i w:val="0"/>
+                <w:color w:val="FFFFFF"/>
+                <w:sz w:val="16"/>
+              </w:rPr>
+              <w:t>CONDICIÓN DE UBICACIÓN</w:t>
+            </w:r>
+          </w:p>
+        </w:tc>
+        <w:tc>
+          <w:tcPr>
+            <w:tcW w:type="dxa" w:w="2608"/>
+            <w:shd w:val="clear" w:color="auto" w:fill="7B1E2B"/>
+            <w:vAlign w:val="center"/>
+          </w:tcPr>
+          <w:p>
+            <w:pPr>
+              <w:keepNext/>
+              <w:spacing w:after="20" w:before="20"/>
+              <w:jc w:val="center"/>
+            </w:pPr>
+            <w:r>
+              <w:rPr>
+                <w:b/>
+                <w:i w:val="0"/>
+                <w:color w:val="FFFFFF"/>
+                <w:sz w:val="16"/>
+              </w:rPr>
+              <w:t>FUENTE</w:t>
+            </w:r>
+          </w:p>
+        </w:tc>
+        <w:tc>
+          <w:tcPr>
+            <w:tcW w:type="dxa" w:w="7427"/>
+            <w:shd w:val="clear" w:color="auto" w:fill="7B1E2B"/>
+            <w:vAlign w:val="center"/>
+          </w:tcPr>
+          <w:p>
+            <w:pPr>
+              <w:keepNext/>
+              <w:spacing w:after="20" w:before="20"/>
+              <w:jc w:val="center"/>
+            </w:pPr>
+            <w:r>
+              <w:rPr>
+                <w:b/>
+                <w:i w:val="0"/>
+                <w:color w:val="FFFFFF"/>
+                <w:sz w:val="16"/>
+              </w:rPr>
+              <w:t>CÓMO LA CUMPLE EL PREDIO O EL PROYECTO</w:t>
+            </w:r>
+          </w:p>
+        </w:tc>
+        <w:tc>
+          <w:tcPr>
+            <w:tcW w:type="dxa" w:w="964"/>
+            <w:shd w:val="clear" w:color="auto" w:fill="7B1E2B"/>
+            <w:vAlign w:val="center"/>
+          </w:tcPr>
+          <w:p>
+            <w:pPr>
+              <w:keepNext/>
+              <w:spacing w:after="20" w:before="20"/>
+              <w:jc w:val="center"/>
+            </w:pPr>
+            <w:r>
+              <w:rPr>
+                <w:b/>
+                <w:i w:val="0"/>
+                <w:color w:val="FFFFFF"/>
+                <w:sz w:val="16"/>
+              </w:rPr>
+              <w:t>ESTADO</w:t>
+            </w:r>
+          </w:p>
+        </w:tc>
+      </w:tr>
+      <w:tr>
+        <w:trPr>
+          <w:cantSplit/>
+        </w:trPr>
+        <w:tc>
+          <w:tcPr>
+            <w:tcW w:type="dxa" w:w="510"/>
+            <w:vAlign w:val="center"/>
+          </w:tcPr>
+          <w:p>
+            <w:pPr>
+              <w:keepNext/>
+              <w:spacing w:after="20" w:before="20"/>
+              <w:jc w:val="center"/>
+            </w:pPr>
+            <w:r>
+              <w:rPr>
+                <w:b w:val="0"/>
+                <w:i w:val="0"/>
+                <w:sz w:val="16"/>
+              </w:rPr>
+              <w:t>1</w:t>
+            </w:r>
+          </w:p>
+        </w:tc>
+        <w:tc>
+          <w:tcPr>
+            <w:tcW w:type="dxa" w:w="3061"/>
+            <w:vAlign w:val="center"/>
+          </w:tcPr>
+          <w:p>
+            <w:pPr>
+              <w:keepNext/>
+              <w:spacing w:after="20" w:before="20"/>
+              <w:jc w:val="left"/>
+            </w:pPr>
+            <w:r>
+              <w:rPr>
+                <w:b w:val="0"/>
+                <w:i w:val="0"/>
+                <w:sz w:val="16"/>
+              </w:rPr>
+              <w:t>Ubicación en zona compatible con la zonificación vigente</w:t>
+            </w:r>
+          </w:p>
+        </w:tc>
+        <w:tc>
+          <w:tcPr>
+            <w:tcW w:type="dxa" w:w="2608"/>
+            <w:vAlign w:val="center"/>
+          </w:tcPr>
+          <w:p>
+            <w:pPr>
+              <w:keepNext/>
+              <w:spacing w:after="20" w:before="20"/>
+              <w:jc w:val="left"/>
+            </w:pPr>
+            <w:r>
+              <w:rPr>
+                <w:b w:val="0"/>
+                <w:i w:val="0"/>
+                <w:sz w:val="16"/>
+              </w:rPr>
+              <w:t>RNE A.090, art. 3</w:t>
+            </w:r>
+          </w:p>
+        </w:tc>
+        <w:tc>
+          <w:tcPr>
+            <w:tcW w:type="dxa" w:w="7427"/>
+            <w:vAlign w:val="center"/>
+          </w:tcPr>
+          <w:p>
+            <w:pPr>
+              <w:keepNext/>
+              <w:spacing w:after="20" w:before="20"/>
+              <w:jc w:val="left"/>
+            </w:pPr>
+            <w:r>
+              <w:rPr>
+                <w:b w:val="0"/>
+                <w:i w:val="0"/>
+                <w:sz w:val="16"/>
+              </w:rPr>
+              <w:t>Predio rural Los Mangos, de propiedad del Gobierno Regional, destinado a servicios de protección social del Estado junto con el CAR Varones y el CAR Mujeres.</w:t>
+            </w:r>
+          </w:p>
+        </w:tc>
+        <w:tc>
+          <w:tcPr>
+            <w:tcW w:type="dxa" w:w="964"/>
+            <w:vAlign w:val="center"/>
+          </w:tcPr>
+          <w:p>
+            <w:pPr>
+              <w:keepNext/>
+              <w:spacing w:after="20" w:before="20"/>
+              <w:jc w:val="center"/>
+            </w:pPr>
+            <w:r>
+              <w:rPr>
+                <w:b w:val="0"/>
+                <w:i w:val="0"/>
+                <w:sz w:val="16"/>
+              </w:rPr>
+              <w:t>CUMPLE</w:t>
+            </w:r>
+          </w:p>
+        </w:tc>
+      </w:tr>
+      <w:tr>
+        <w:trPr>
+          <w:cantSplit/>
+        </w:trPr>
+        <w:tc>
+          <w:tcPr>
+            <w:tcW w:type="dxa" w:w="510"/>
+            <w:vAlign w:val="center"/>
+          </w:tcPr>
+          <w:p>
+            <w:pPr>
+              <w:keepNext/>
+              <w:spacing w:after="20" w:before="20"/>
+              <w:jc w:val="center"/>
+            </w:pPr>
+            <w:r>
+              <w:rPr>
+                <w:b w:val="0"/>
+                <w:i w:val="0"/>
+                <w:sz w:val="16"/>
+              </w:rPr>
+              <w:t>2</w:t>
+            </w:r>
+          </w:p>
+        </w:tc>
+        <w:tc>
+          <w:tcPr>
+            <w:tcW w:type="dxa" w:w="3061"/>
+            <w:vAlign w:val="center"/>
+          </w:tcPr>
+          <w:p>
+            <w:pPr>
+              <w:keepNext/>
+              <w:spacing w:after="20" w:before="20"/>
+              <w:jc w:val="left"/>
+            </w:pPr>
+            <w:r>
+              <w:rPr>
+                <w:b w:val="0"/>
+                <w:i w:val="0"/>
+                <w:sz w:val="16"/>
+              </w:rPr>
+              <w:t>Zona tranquila y no aislada</w:t>
+            </w:r>
+          </w:p>
+        </w:tc>
+        <w:tc>
+          <w:tcPr>
+            <w:tcW w:type="dxa" w:w="2608"/>
+            <w:vAlign w:val="center"/>
+          </w:tcPr>
+          <w:p>
+            <w:pPr>
+              <w:keepNext/>
+              <w:spacing w:after="20" w:before="20"/>
+              <w:jc w:val="left"/>
+            </w:pPr>
+            <w:r>
+              <w:rPr>
+                <w:b w:val="0"/>
+                <w:i w:val="0"/>
+                <w:sz w:val="16"/>
+              </w:rPr>
+              <w:t>Lineamientos ONU-Habitat / CONAVIM, num. 2.1</w:t>
+            </w:r>
+          </w:p>
+        </w:tc>
+        <w:tc>
+          <w:tcPr>
+            <w:tcW w:type="dxa" w:w="7427"/>
+            <w:vAlign w:val="center"/>
+          </w:tcPr>
+          <w:p>
+            <w:pPr>
+              <w:keepNext/>
+              <w:spacing w:after="20" w:before="20"/>
+              <w:jc w:val="left"/>
+            </w:pPr>
+            <w:r>
+              <w:rPr>
+                <w:b w:val="0"/>
+                <w:i w:val="0"/>
+                <w:sz w:val="16"/>
+              </w:rPr>
+              <w:t>Entorno urbano de Morales y Tarapoto, con frente a la carretera Oasis y colindante con otros servicios de protección; sin bares, discotecas ni casinos en el entorno (Cuadro N.° 1, filas 5, 17 y 18).</w:t>
+            </w:r>
+          </w:p>
+        </w:tc>
+        <w:tc>
+          <w:tcPr>
+            <w:tcW w:type="dxa" w:w="964"/>
+            <w:vAlign w:val="center"/>
+          </w:tcPr>
+          <w:p>
+            <w:pPr>
+              <w:keepNext/>
+              <w:spacing w:after="20" w:before="20"/>
+              <w:jc w:val="center"/>
+            </w:pPr>
+            <w:r>
+              <w:rPr>
+                <w:b w:val="0"/>
+                <w:i w:val="0"/>
+                <w:sz w:val="16"/>
+              </w:rPr>
+              <w:t>CUMPLE</w:t>
+            </w:r>
+          </w:p>
+        </w:tc>
+      </w:tr>
+      <w:tr>
+        <w:trPr>
+          <w:cantSplit/>
+        </w:trPr>
+        <w:tc>
+          <w:tcPr>
+            <w:tcW w:type="dxa" w:w="510"/>
+            <w:vAlign w:val="center"/>
+          </w:tcPr>
+          <w:p>
+            <w:pPr>
+              <w:keepNext/>
+              <w:spacing w:after="20" w:before="20"/>
+              <w:jc w:val="center"/>
+            </w:pPr>
+            <w:r>
+              <w:rPr>
+                <w:b w:val="0"/>
+                <w:i w:val="0"/>
+                <w:sz w:val="16"/>
+              </w:rPr>
+              <w:t>3</w:t>
+            </w:r>
+          </w:p>
+        </w:tc>
+        <w:tc>
+          <w:tcPr>
+            <w:tcW w:type="dxa" w:w="3061"/>
+            <w:vAlign w:val="center"/>
+          </w:tcPr>
+          <w:p>
+            <w:pPr>
+              <w:keepNext/>
+              <w:spacing w:after="20" w:before="20"/>
+              <w:jc w:val="left"/>
+            </w:pPr>
+            <w:r>
+              <w:rPr>
+                <w:b w:val="0"/>
+                <w:i w:val="0"/>
+                <w:sz w:val="16"/>
+              </w:rPr>
+              <w:t>Servicios e instituciones de apoyo cercanos (salud, seguridad y justicia)</w:t>
+            </w:r>
+          </w:p>
+        </w:tc>
+        <w:tc>
+          <w:tcPr>
+            <w:tcW w:type="dxa" w:w="2608"/>
+            <w:vAlign w:val="center"/>
+          </w:tcPr>
+          <w:p>
+            <w:pPr>
+              <w:keepNext/>
+              <w:spacing w:after="20" w:before="20"/>
+              <w:jc w:val="left"/>
+            </w:pPr>
+            <w:r>
+              <w:rPr>
+                <w:b w:val="0"/>
+                <w:i w:val="0"/>
+                <w:sz w:val="16"/>
+              </w:rPr>
+              <w:t>Lineamientos, num. 2.1</w:t>
+            </w:r>
+          </w:p>
+        </w:tc>
+        <w:tc>
+          <w:tcPr>
+            <w:tcW w:type="dxa" w:w="7427"/>
+            <w:vAlign w:val="center"/>
+          </w:tcPr>
+          <w:p>
+            <w:pPr>
+              <w:keepNext/>
+              <w:spacing w:after="20" w:before="20"/>
+              <w:jc w:val="left"/>
+            </w:pPr>
+            <w:r>
+              <w:rPr>
+                <w:b w:val="0"/>
+                <w:i w:val="0"/>
+                <w:sz w:val="16"/>
+              </w:rPr>
+              <w:t>Servicios de salud, seguridad y justicia del distrito de Morales y de la ciudad de Tarapoto en el entorno urbano; el establecimiento de salud de la localidad está a más de 100 m (Cuadro N.° 1, fila 2).</w:t>
+            </w:r>
+          </w:p>
+        </w:tc>
+        <w:tc>
+          <w:tcPr>
+            <w:tcW w:type="dxa" w:w="964"/>
+            <w:vAlign w:val="center"/>
+          </w:tcPr>
+          <w:p>
+            <w:pPr>
+              <w:keepNext/>
+              <w:spacing w:after="20" w:before="20"/>
+              <w:jc w:val="center"/>
+            </w:pPr>
+            <w:r>
+              <w:rPr>
+                <w:b w:val="0"/>
+                <w:i w:val="0"/>
+                <w:sz w:val="16"/>
+              </w:rPr>
+              <w:t>CUMPLE</w:t>
+            </w:r>
+          </w:p>
+        </w:tc>
+      </w:tr>
+      <w:tr>
+        <w:trPr>
+          <w:cantSplit/>
+        </w:trPr>
+        <w:tc>
+          <w:tcPr>
+            <w:tcW w:type="dxa" w:w="510"/>
+            <w:vAlign w:val="center"/>
+          </w:tcPr>
+          <w:p>
+            <w:pPr>
+              <w:keepNext/>
+              <w:spacing w:after="20" w:before="20"/>
+              <w:jc w:val="center"/>
+            </w:pPr>
+            <w:r>
+              <w:rPr>
+                <w:b w:val="0"/>
+                <w:i w:val="0"/>
+                <w:sz w:val="16"/>
+              </w:rPr>
+              <w:t>4</w:t>
+            </w:r>
+          </w:p>
+        </w:tc>
+        <w:tc>
+          <w:tcPr>
+            <w:tcW w:type="dxa" w:w="3061"/>
+            <w:vAlign w:val="center"/>
+          </w:tcPr>
+          <w:p>
+            <w:pPr>
+              <w:keepNext/>
+              <w:spacing w:after="20" w:before="20"/>
+              <w:jc w:val="left"/>
+            </w:pPr>
+            <w:r>
+              <w:rPr>
+                <w:b w:val="0"/>
+                <w:i w:val="0"/>
+                <w:sz w:val="16"/>
+              </w:rPr>
+              <w:t>Accesos vehicular y peatonal, sin estudio de impacto vial</w:t>
+            </w:r>
+          </w:p>
+        </w:tc>
+        <w:tc>
+          <w:tcPr>
+            <w:tcW w:type="dxa" w:w="2608"/>
+            <w:vAlign w:val="center"/>
+          </w:tcPr>
+          <w:p>
+            <w:pPr>
+              <w:keepNext/>
+              <w:spacing w:after="20" w:before="20"/>
+              <w:jc w:val="left"/>
+            </w:pPr>
+            <w:r>
+              <w:rPr>
+                <w:b w:val="0"/>
+                <w:i w:val="0"/>
+                <w:sz w:val="16"/>
+              </w:rPr>
+              <w:t>Lineamientos, num. 2.1 y 2.6; RNE A.090, art. 4</w:t>
+            </w:r>
+          </w:p>
+        </w:tc>
+        <w:tc>
+          <w:tcPr>
+            <w:tcW w:type="dxa" w:w="7427"/>
+            <w:vAlign w:val="center"/>
+          </w:tcPr>
+          <w:p>
+            <w:pPr>
+              <w:keepNext/>
+              <w:spacing w:after="20" w:before="20"/>
+              <w:jc w:val="left"/>
+            </w:pPr>
+            <w:r>
+              <w:rPr>
+                <w:b w:val="0"/>
+                <w:i w:val="0"/>
+                <w:sz w:val="16"/>
+              </w:rPr>
+              <w:t>Acceso por la carretera Oasis, con ingreso principal y de servicio controlados. La población del hogar es menor de 500 personas, por lo que la A.090 (art. 4) no exige estudio de impacto vial.</w:t>
+            </w:r>
+          </w:p>
+        </w:tc>
+        <w:tc>
+          <w:tcPr>
+            <w:tcW w:type="dxa" w:w="964"/>
+            <w:vAlign w:val="center"/>
+          </w:tcPr>
+          <w:p>
+            <w:pPr>
+              <w:keepNext/>
+              <w:spacing w:after="20" w:before="20"/>
+              <w:jc w:val="center"/>
+            </w:pPr>
+            <w:r>
+              <w:rPr>
+                <w:b w:val="0"/>
+                <w:i w:val="0"/>
+                <w:sz w:val="16"/>
+              </w:rPr>
+              <w:t>CUMPLE</w:t>
+            </w:r>
+          </w:p>
+        </w:tc>
+      </w:tr>
+      <w:tr>
+        <w:trPr>
+          <w:cantSplit/>
+        </w:trPr>
+        <w:tc>
+          <w:tcPr>
+            <w:tcW w:type="dxa" w:w="510"/>
+            <w:vAlign w:val="center"/>
+          </w:tcPr>
+          <w:p>
+            <w:pPr>
+              <w:keepNext/>
+              <w:spacing w:after="20" w:before="20"/>
+              <w:jc w:val="center"/>
+            </w:pPr>
+            <w:r>
+              <w:rPr>
+                <w:b w:val="0"/>
+                <w:i w:val="0"/>
+                <w:sz w:val="16"/>
+              </w:rPr>
+              <w:t>5</w:t>
+            </w:r>
+          </w:p>
+        </w:tc>
+        <w:tc>
+          <w:tcPr>
+            <w:tcW w:type="dxa" w:w="3061"/>
+            <w:vAlign w:val="center"/>
+          </w:tcPr>
+          <w:p>
+            <w:pPr>
+              <w:keepNext/>
+              <w:spacing w:after="20" w:before="20"/>
+              <w:jc w:val="left"/>
+            </w:pPr>
+            <w:r>
+              <w:rPr>
+                <w:b w:val="0"/>
+                <w:i w:val="0"/>
+                <w:sz w:val="16"/>
+              </w:rPr>
+              <w:t>Seguridad frente a agresiones externas</w:t>
+            </w:r>
+          </w:p>
+        </w:tc>
+        <w:tc>
+          <w:tcPr>
+            <w:tcW w:type="dxa" w:w="2608"/>
+            <w:vAlign w:val="center"/>
+          </w:tcPr>
+          <w:p>
+            <w:pPr>
+              <w:keepNext/>
+              <w:spacing w:after="20" w:before="20"/>
+              <w:jc w:val="left"/>
+            </w:pPr>
+            <w:r>
+              <w:rPr>
+                <w:b w:val="0"/>
+                <w:i w:val="0"/>
+                <w:sz w:val="16"/>
+              </w:rPr>
+              <w:t>Lineamientos, num. 2.4</w:t>
+            </w:r>
+          </w:p>
+        </w:tc>
+        <w:tc>
+          <w:tcPr>
+            <w:tcW w:type="dxa" w:w="7427"/>
+            <w:vAlign w:val="center"/>
+          </w:tcPr>
+          <w:p>
+            <w:pPr>
+              <w:keepNext/>
+              <w:spacing w:after="20" w:before="20"/>
+              <w:jc w:val="left"/>
+            </w:pPr>
+            <w:r>
+              <w:rPr>
+                <w:b w:val="0"/>
+                <w:i w:val="0"/>
+                <w:sz w:val="16"/>
+              </w:rPr>
+              <w:t>Recinto con cerco perimétrico, caseta de control en los accesos y cuarto de cámaras del circuito cerrado de vigilancia.</w:t>
+            </w:r>
+          </w:p>
+        </w:tc>
+        <w:tc>
+          <w:tcPr>
+            <w:tcW w:type="dxa" w:w="964"/>
+            <w:vAlign w:val="center"/>
+          </w:tcPr>
+          <w:p>
+            <w:pPr>
+              <w:keepNext/>
+              <w:spacing w:after="20" w:before="20"/>
+              <w:jc w:val="center"/>
+            </w:pPr>
+            <w:r>
+              <w:rPr>
+                <w:b w:val="0"/>
+                <w:i w:val="0"/>
+                <w:sz w:val="16"/>
+              </w:rPr>
+              <w:t>CUMPLE</w:t>
+            </w:r>
+          </w:p>
+        </w:tc>
+      </w:tr>
+      <w:tr>
+        <w:trPr>
+          <w:cantSplit/>
+        </w:trPr>
+        <w:tc>
+          <w:tcPr>
+            <w:tcW w:type="dxa" w:w="510"/>
+            <w:vAlign w:val="center"/>
+          </w:tcPr>
+          <w:p>
+            <w:pPr>
+              <w:keepNext/>
+              <w:spacing w:after="20" w:before="20"/>
+              <w:jc w:val="center"/>
+            </w:pPr>
+            <w:r>
+              <w:rPr>
+                <w:b w:val="0"/>
+                <w:i w:val="0"/>
+                <w:sz w:val="16"/>
+              </w:rPr>
+              <w:t>6</w:t>
+            </w:r>
+          </w:p>
+        </w:tc>
+        <w:tc>
+          <w:tcPr>
+            <w:tcW w:type="dxa" w:w="3061"/>
+            <w:vAlign w:val="center"/>
+          </w:tcPr>
+          <w:p>
+            <w:pPr>
+              <w:keepNext/>
+              <w:spacing w:after="20" w:before="20"/>
+              <w:jc w:val="left"/>
+            </w:pPr>
+            <w:r>
+              <w:rPr>
+                <w:b w:val="0"/>
+                <w:i w:val="0"/>
+                <w:sz w:val="16"/>
+              </w:rPr>
+              <w:t>Reserva del uso y privacidad de las residentes</w:t>
+            </w:r>
+          </w:p>
+        </w:tc>
+        <w:tc>
+          <w:tcPr>
+            <w:tcW w:type="dxa" w:w="2608"/>
+            <w:vAlign w:val="center"/>
+          </w:tcPr>
+          <w:p>
+            <w:pPr>
+              <w:keepNext/>
+              <w:spacing w:after="20" w:before="20"/>
+              <w:jc w:val="left"/>
+            </w:pPr>
+            <w:r>
+              <w:rPr>
+                <w:b w:val="0"/>
+                <w:i w:val="0"/>
+                <w:sz w:val="16"/>
+              </w:rPr>
+              <w:t>Lineamientos, num. 2.2 y 2.3</w:t>
+            </w:r>
+          </w:p>
+        </w:tc>
+        <w:tc>
+          <w:tcPr>
+            <w:tcW w:type="dxa" w:w="7427"/>
+            <w:vAlign w:val="center"/>
+          </w:tcPr>
+          <w:p>
+            <w:pPr>
+              <w:keepNext/>
+              <w:spacing w:after="20" w:before="20"/>
+              <w:jc w:val="left"/>
+            </w:pPr>
+            <w:r>
+              <w:rPr>
+                <w:b w:val="0"/>
+                <w:i w:val="0"/>
+                <w:sz w:val="16"/>
+              </w:rPr>
+              <w:t>Conjunto de edificaciones dentro de un recinto cercado, sin anuncios que revelen el uso; los predios colindantes son servicios del Estado de acceso restringido.</w:t>
+            </w:r>
+          </w:p>
+        </w:tc>
+        <w:tc>
+          <w:tcPr>
+            <w:tcW w:type="dxa" w:w="964"/>
+            <w:vAlign w:val="center"/>
+          </w:tcPr>
+          <w:p>
+            <w:pPr>
+              <w:keepNext/>
+              <w:spacing w:after="20" w:before="20"/>
+              <w:jc w:val="center"/>
+            </w:pPr>
+            <w:r>
+              <w:rPr>
+                <w:b w:val="0"/>
+                <w:i w:val="0"/>
+                <w:sz w:val="16"/>
+              </w:rPr>
+              <w:t>CUMPLE</w:t>
+            </w:r>
+          </w:p>
+        </w:tc>
+      </w:tr>
+      <w:tr>
+        <w:trPr>
+          <w:cantSplit/>
+        </w:trPr>
+        <w:tc>
+          <w:tcPr>
+            <w:tcW w:type="dxa" w:w="510"/>
+            <w:vAlign w:val="center"/>
+          </w:tcPr>
+          <w:p>
+            <w:pPr>
+              <w:keepNext/>
+              <w:spacing w:after="20" w:before="20"/>
+              <w:jc w:val="center"/>
+            </w:pPr>
+            <w:r>
+              <w:rPr>
+                <w:b w:val="0"/>
+                <w:i w:val="0"/>
+                <w:sz w:val="16"/>
+              </w:rPr>
+              <w:t>7</w:t>
+            </w:r>
+          </w:p>
+        </w:tc>
+        <w:tc>
+          <w:tcPr>
+            <w:tcW w:type="dxa" w:w="3061"/>
+            <w:vAlign w:val="center"/>
+          </w:tcPr>
+          <w:p>
+            <w:pPr>
+              <w:keepNext/>
+              <w:spacing w:after="20" w:before="20"/>
+              <w:jc w:val="left"/>
+            </w:pPr>
+            <w:r>
+              <w:rPr>
+                <w:b w:val="0"/>
+                <w:i w:val="0"/>
+                <w:sz w:val="16"/>
+              </w:rPr>
+              <w:t>Servicios básicos</w:t>
+            </w:r>
+          </w:p>
+        </w:tc>
+        <w:tc>
+          <w:tcPr>
+            <w:tcW w:type="dxa" w:w="2608"/>
+            <w:vAlign w:val="center"/>
+          </w:tcPr>
+          <w:p>
+            <w:pPr>
+              <w:keepNext/>
+              <w:spacing w:after="20" w:before="20"/>
+              <w:jc w:val="left"/>
+            </w:pPr>
+            <w:r>
+              <w:rPr>
+                <w:b w:val="0"/>
+                <w:i w:val="0"/>
+                <w:sz w:val="16"/>
+              </w:rPr>
+              <w:t>Lineamientos, num. 2.8; RNE A.040, art. 7 d)</w:t>
+            </w:r>
+          </w:p>
+        </w:tc>
+        <w:tc>
+          <w:tcPr>
+            <w:tcW w:type="dxa" w:w="7427"/>
+            <w:vAlign w:val="center"/>
+          </w:tcPr>
+          <w:p>
+            <w:pPr>
+              <w:keepNext/>
+              <w:spacing w:after="20" w:before="20"/>
+              <w:jc w:val="left"/>
+            </w:pPr>
+            <w:r>
+              <w:rPr>
+                <w:b w:val="0"/>
+                <w:i w:val="0"/>
+                <w:sz w:val="16"/>
+              </w:rPr>
+              <w:t>El proyecto contempla cisterna y tanque elevado, tratamiento de aguas residuales, subestación eléctrica, grupo electrógeno y drenaje pluvial.</w:t>
+            </w:r>
+          </w:p>
+        </w:tc>
+        <w:tc>
+          <w:tcPr>
+            <w:tcW w:type="dxa" w:w="964"/>
+            <w:vAlign w:val="center"/>
+          </w:tcPr>
+          <w:p>
+            <w:pPr>
+              <w:keepNext/>
+              <w:spacing w:after="20" w:before="20"/>
+              <w:jc w:val="center"/>
+            </w:pPr>
+            <w:r>
+              <w:rPr>
+                <w:b w:val="0"/>
+                <w:i w:val="0"/>
+                <w:sz w:val="16"/>
+              </w:rPr>
+              <w:t>CUMPLE</w:t>
+            </w:r>
+          </w:p>
+        </w:tc>
+      </w:tr>
+      <w:tr>
+        <w:trPr>
+          <w:cantSplit/>
+        </w:trPr>
+        <w:tc>
+          <w:tcPr>
+            <w:tcW w:type="dxa" w:w="510"/>
+            <w:vAlign w:val="center"/>
+          </w:tcPr>
+          <w:p>
+            <w:pPr>
+              <w:spacing w:after="20" w:before="20"/>
+              <w:jc w:val="center"/>
+            </w:pPr>
+            <w:r>
+              <w:rPr>
+                <w:b w:val="0"/>
+                <w:i w:val="0"/>
+                <w:sz w:val="16"/>
+              </w:rPr>
+              <w:t>8</w:t>
+            </w:r>
+          </w:p>
+        </w:tc>
+        <w:tc>
+          <w:tcPr>
+            <w:tcW w:type="dxa" w:w="3061"/>
+            <w:vAlign w:val="center"/>
+          </w:tcPr>
+          <w:p>
+            <w:pPr>
+              <w:spacing w:after="20" w:before="20"/>
+              <w:jc w:val="left"/>
+            </w:pPr>
+            <w:r>
+              <w:rPr>
+                <w:b w:val="0"/>
+                <w:i w:val="0"/>
+                <w:sz w:val="16"/>
+              </w:rPr>
+              <w:t>Protección frente a lluvias intensas</w:t>
+            </w:r>
+          </w:p>
+        </w:tc>
+        <w:tc>
+          <w:tcPr>
+            <w:tcW w:type="dxa" w:w="2608"/>
+            <w:vAlign w:val="center"/>
+          </w:tcPr>
+          <w:p>
+            <w:pPr>
+              <w:spacing w:after="20" w:before="20"/>
+              <w:jc w:val="left"/>
+            </w:pPr>
+            <w:r>
+              <w:rPr>
+                <w:b w:val="0"/>
+                <w:i w:val="0"/>
+                <w:sz w:val="16"/>
+              </w:rPr>
+              <w:t>RNE OS.060 (drenaje pluvial urbano)</w:t>
+            </w:r>
+          </w:p>
+        </w:tc>
+        <w:tc>
+          <w:tcPr>
+            <w:tcW w:type="dxa" w:w="7427"/>
+            <w:vAlign w:val="center"/>
+          </w:tcPr>
+          <w:p>
+            <w:pPr>
+              <w:spacing w:after="20" w:before="20"/>
+              <w:jc w:val="left"/>
+            </w:pPr>
+            <w:r>
+              <w:rPr>
+                <w:b w:val="0"/>
+                <w:i w:val="0"/>
+                <w:sz w:val="16"/>
+              </w:rPr>
+              <w:t>Drenaje pluvial del predio con colector frontal y cunetas, dimensionado con la hidrología del expediente; las obras quedan dentro del lindero.</w:t>
             </w:r>
           </w:p>
         </w:tc>
@@ -3776,7 +4980,7 @@
         <w:pStyle w:val="Heading1"/>
       </w:pPr>
       <w:r>
-        <w:t>5.  CONCLUSIONES</w:t>
+        <w:t>6.  CONCLUSIONES</w:t>
       </w:r>
     </w:p>
     <w:p>
@@ -3790,7 +4994,7 @@
           <w:b w:val="0"/>
           <w:i w:val="0"/>
         </w:rPr>
-        <w:t>•  El predio cumple las 18 condiciones del cuadro de incompatibilidades de uso: no existen dentro de su área de influencia las actividades, instalaciones ni servidumbres que restringen la ubicación del Hogar de Refugio Temporal.</w:t>
+        <w:t>•  El predio cumple las 18 condiciones del Cuadro N.° 1: no existen dentro de su área de influencia las actividades, instalaciones ni servidumbres que la normativa sectorial considera incompatibles con la permanencia de mujeres, niñas y niños.</w:t>
       </w:r>
     </w:p>
     <w:p>
@@ -3804,7 +5008,21 @@
           <w:b w:val="0"/>
           <w:i w:val="0"/>
         </w:rPr>
-        <w:t>•  La ubicación cumple la Norma A.090 (art. 3) y la Norma A.040 (art. 7 b): el hogar se emplaza en una zona compatible y sin incompatibilidades de uso.</w:t>
+        <w:t>•  El predio y el proyecto cumplen las 8 condiciones de ubicación propias del Hogar de Refugio Temporal (Cuadro N.° 2): zona compatible, tranquila y no aislada, con servicios de apoyo cercanos, accesos controlados, seguridad perimetral, reserva del uso, servicios básicos y drenaje pluvial.</w:t>
+      </w:r>
+    </w:p>
+    <w:p>
+      <w:pPr>
+        <w:spacing w:before="0" w:after="60" w:line="276" w:lineRule="auto"/>
+        <w:ind w:left="510" w:hanging="255"/>
+        <w:jc w:val="both"/>
+      </w:pPr>
+      <w:r>
+        <w:rPr>
+          <w:b w:val="0"/>
+          <w:i w:val="0"/>
+        </w:rPr>
+        <w:t>•  La ubicación cumple la Norma A.090 (arts. 3 y 4) y la Norma A.040 (art. 7 b): el hogar se emplaza en una zona compatible, sin incompatibilidades de uso y sin necesidad de estudio de impacto vial.</w:t>
       </w:r>
     </w:p>
     <w:p>
@@ -3832,7 +5050,7 @@
           <w:b w:val="0"/>
           <w:i w:val="0"/>
         </w:rPr>
-        <w:t>•  La ubicación responde además a los lineamientos para refugios: zona tranquila, no aislada, con servicios cercanos y acceso vehicular.</w:t>
+        <w:t>•  Por lo expuesto, el terreno es apto para el Hogar de Refugio Temporal para mujeres víctimas de violencia.</w:t>
       </w:r>
     </w:p>
     <w:sectPr>

</xml_diff>